<commit_message>
Updated questions and lists
</commit_message>
<xml_diff>
--- a/lists/xls/sajt_2.docx
+++ b/lists/xls/sajt_2.docx
@@ -1774,6 +1774,17 @@
           <w:szCs w:val="28"/>
         </w:rPr>
       </w:pPr>
+    </w:p>
+    <w:p>
+      <w:pPr>
+        <w:jc w:val="center"/>
+        <w:rPr>
+          <w:rFonts w:cstheme="minorHAnsi"/>
+          <w:b/>
+          <w:sz w:val="28"/>
+          <w:szCs w:val="28"/>
+        </w:rPr>
+      </w:pPr>
       <w:r>
         <w:rPr>
           <w:rFonts w:cstheme="minorHAnsi"/>
@@ -1781,7 +1792,6 @@
           <w:sz w:val="28"/>
           <w:szCs w:val="28"/>
         </w:rPr>
-        <w:lastRenderedPageBreak/>
         <w:t>P</w:t>
       </w:r>
       <w:r>
@@ -2320,14 +2330,7 @@
               <w:rPr>
                 <w:rFonts w:cstheme="minorHAnsi"/>
               </w:rPr>
-              <w:t xml:space="preserve">14, 15, 16, </w:t>
-            </w:r>
-            <w:proofErr w:type="gramStart"/>
-            <w:r>
-              <w:rPr>
-                <w:rFonts w:cstheme="minorHAnsi"/>
-              </w:rPr>
-              <w:t xml:space="preserve">17,  </w:t>
+              <w:t xml:space="preserve">14, 15, 16, 17,  </w:t>
             </w:r>
             <w:r>
               <w:rPr>
@@ -2335,7 +2338,6 @@
               </w:rPr>
               <w:t>22</w:t>
             </w:r>
-            <w:proofErr w:type="gramEnd"/>
           </w:p>
         </w:tc>
       </w:tr>
@@ -2404,14 +2406,7 @@
               <w:rPr>
                 <w:rFonts w:cstheme="minorHAnsi"/>
               </w:rPr>
-              <w:t xml:space="preserve">  </w:t>
-            </w:r>
-            <w:proofErr w:type="gramStart"/>
-            <w:r>
-              <w:rPr>
-                <w:rFonts w:cstheme="minorHAnsi"/>
-              </w:rPr>
-              <w:t xml:space="preserve">  </w:t>
+              <w:t xml:space="preserve">    </w:t>
             </w:r>
             <w:r>
               <w:rPr>
@@ -2420,7 +2415,6 @@
               </w:rPr>
               <w:t xml:space="preserve"> (</w:t>
             </w:r>
-            <w:proofErr w:type="gramEnd"/>
             <w:r>
               <w:rPr>
                 <w:rFonts w:cstheme="minorHAnsi"/>
@@ -2572,6 +2566,12 @@
                 <w:highlight w:val="yellow"/>
               </w:rPr>
               <w:t>110</w:t>
+            </w:r>
+            <w:r>
+              <w:rPr>
+                <w:rFonts w:cstheme="minorHAnsi"/>
+              </w:rPr>
+              <w:t xml:space="preserve">, </w:t>
             </w:r>
           </w:p>
         </w:tc>
@@ -2664,7 +2664,6 @@
               </w:rPr>
               <w:t xml:space="preserve">9, </w:t>
             </w:r>
-            <w:proofErr w:type="gramStart"/>
             <w:r>
               <w:rPr>
                 <w:rFonts w:cstheme="minorHAnsi"/>
@@ -2684,17 +2683,7 @@
                 <w:sz w:val="24"/>
                 <w:szCs w:val="24"/>
               </w:rPr>
-              <w:t>(</w:t>
-            </w:r>
-            <w:proofErr w:type="gramEnd"/>
-            <w:r>
-              <w:rPr>
-                <w:rFonts w:cstheme="minorHAnsi"/>
-                <w:color w:val="FF0000"/>
-                <w:sz w:val="24"/>
-                <w:szCs w:val="24"/>
-              </w:rPr>
-              <w:t>1</w:t>
+              <w:t>(1</w:t>
             </w:r>
             <w:r>
               <w:rPr>
@@ -2747,6 +2736,26 @@
                 <w:rFonts w:cstheme="minorHAnsi"/>
               </w:rPr>
               <w:t>, 23</w:t>
+            </w:r>
+            <w:r>
+              <w:rPr>
+                <w:rFonts w:cstheme="minorHAnsi"/>
+              </w:rPr>
+              <w:t xml:space="preserve">, </w:t>
+            </w:r>
+            <w:r>
+              <w:rPr>
+                <w:rFonts w:cstheme="minorHAnsi"/>
+                <w:highlight w:val="yellow"/>
+              </w:rPr>
+              <w:t>11</w:t>
+            </w:r>
+            <w:r>
+              <w:rPr>
+                <w:rFonts w:cstheme="minorHAnsi"/>
+                <w:highlight w:val="yellow"/>
+              </w:rPr>
+              <w:t>1</w:t>
             </w:r>
           </w:p>
         </w:tc>
@@ -3184,14 +3193,7 @@
               <w:rPr>
                 <w:rFonts w:cstheme="minorHAnsi"/>
               </w:rPr>
-              <w:t xml:space="preserve">       </w:t>
-            </w:r>
-            <w:proofErr w:type="gramStart"/>
-            <w:r>
-              <w:rPr>
-                <w:rFonts w:cstheme="minorHAnsi"/>
-              </w:rPr>
-              <w:t xml:space="preserve">   </w:t>
+              <w:t xml:space="preserve">          </w:t>
             </w:r>
             <w:r>
               <w:rPr>
@@ -3200,17 +3202,7 @@
                 <w:sz w:val="24"/>
                 <w:szCs w:val="24"/>
               </w:rPr>
-              <w:t>(</w:t>
-            </w:r>
-            <w:proofErr w:type="gramEnd"/>
-            <w:r>
-              <w:rPr>
-                <w:rFonts w:cstheme="minorHAnsi"/>
-                <w:color w:val="FF0000"/>
-                <w:sz w:val="24"/>
-                <w:szCs w:val="24"/>
-              </w:rPr>
-              <w:t>2)</w:t>
+              <w:t>(2)</w:t>
             </w:r>
           </w:p>
         </w:tc>
@@ -3649,7 +3641,6 @@
               <w:t xml:space="preserve">, </w:t>
             </w:r>
             <w:proofErr w:type="spellStart"/>
-            <w:proofErr w:type="gramStart"/>
             <w:r>
               <w:rPr>
                 <w:rFonts w:cstheme="minorHAnsi"/>
@@ -3683,7 +3674,6 @@
               <w:t>ovi</w:t>
             </w:r>
             <w:proofErr w:type="spellEnd"/>
-            <w:proofErr w:type="gramEnd"/>
             <w:r>
               <w:rPr>
                 <w:rFonts w:cstheme="minorHAnsi"/>
@@ -4103,6 +4093,19 @@
               </w:rPr>
               <w:t>56</w:t>
             </w:r>
+            <w:r>
+              <w:rPr>
+                <w:rFonts w:cstheme="minorHAnsi"/>
+              </w:rPr>
+              <w:t xml:space="preserve">, </w:t>
+            </w:r>
+            <w:r>
+              <w:rPr>
+                <w:rFonts w:cstheme="minorHAnsi"/>
+                <w:highlight w:val="yellow"/>
+              </w:rPr>
+              <w:t>112</w:t>
+            </w:r>
           </w:p>
         </w:tc>
       </w:tr>
@@ -4384,14 +4387,7 @@
               <w:rPr>
                 <w:rFonts w:cstheme="minorHAnsi"/>
               </w:rPr>
-              <w:t xml:space="preserve">         </w:t>
-            </w:r>
-            <w:proofErr w:type="gramStart"/>
-            <w:r>
-              <w:rPr>
-                <w:rFonts w:cstheme="minorHAnsi"/>
-              </w:rPr>
-              <w:t xml:space="preserve">  </w:t>
+              <w:t xml:space="preserve">           </w:t>
             </w:r>
             <w:r>
               <w:rPr>
@@ -4404,15 +4400,7 @@
                 <w:rFonts w:cstheme="minorHAnsi"/>
                 <w:color w:val="FF0000"/>
               </w:rPr>
-              <w:t>(</w:t>
-            </w:r>
-            <w:proofErr w:type="gramEnd"/>
-            <w:r>
-              <w:rPr>
-                <w:rFonts w:cstheme="minorHAnsi"/>
-                <w:color w:val="FF0000"/>
-              </w:rPr>
-              <w:t>1)</w:t>
+              <w:t>(1)</w:t>
             </w:r>
           </w:p>
         </w:tc>
@@ -4466,21 +4454,7 @@
               <w:rPr>
                 <w:rFonts w:cstheme="minorHAnsi"/>
               </w:rPr>
-              <w:t xml:space="preserve">2, </w:t>
-            </w:r>
-            <w:proofErr w:type="gramStart"/>
-            <w:r>
-              <w:rPr>
-                <w:rFonts w:cstheme="minorHAnsi"/>
-              </w:rPr>
-              <w:t>4,  7</w:t>
-            </w:r>
-            <w:proofErr w:type="gramEnd"/>
-            <w:r>
-              <w:rPr>
-                <w:rFonts w:cstheme="minorHAnsi"/>
-              </w:rPr>
-              <w:t xml:space="preserve">, 8, </w:t>
+              <w:t xml:space="preserve">2, 4,  7, 8, </w:t>
             </w:r>
             <w:r>
               <w:rPr>
@@ -4668,29 +4642,14 @@
               <w:rPr>
                 <w:rFonts w:cstheme="minorHAnsi"/>
               </w:rPr>
-              <w:t xml:space="preserve">     </w:t>
-            </w:r>
-            <w:proofErr w:type="gramStart"/>
-            <w:r>
-              <w:rPr>
-                <w:rFonts w:cstheme="minorHAnsi"/>
-              </w:rPr>
-              <w:t xml:space="preserve">   </w:t>
+              <w:t xml:space="preserve">        </w:t>
             </w:r>
             <w:r>
               <w:rPr>
                 <w:rFonts w:cstheme="minorHAnsi"/>
                 <w:color w:val="FF0000"/>
               </w:rPr>
-              <w:t>(</w:t>
-            </w:r>
-            <w:proofErr w:type="gramEnd"/>
-            <w:r>
-              <w:rPr>
-                <w:rFonts w:cstheme="minorHAnsi"/>
-                <w:color w:val="FF0000"/>
-              </w:rPr>
-              <w:t>1)</w:t>
+              <w:t>(1)</w:t>
             </w:r>
           </w:p>
         </w:tc>
@@ -4885,6 +4844,25 @@
               </w:rPr>
               <w:t>103</w:t>
             </w:r>
+            <w:r>
+              <w:rPr>
+                <w:rFonts w:cstheme="minorHAnsi"/>
+              </w:rPr>
+              <w:t>,</w:t>
+            </w:r>
+            <w:r>
+              <w:rPr>
+                <w:rFonts w:cstheme="minorHAnsi"/>
+              </w:rPr>
+              <w:t xml:space="preserve"> </w:t>
+            </w:r>
+            <w:r>
+              <w:rPr>
+                <w:rFonts w:cstheme="minorHAnsi"/>
+                <w:highlight w:val="yellow"/>
+              </w:rPr>
+              <w:t>106</w:t>
+            </w:r>
           </w:p>
         </w:tc>
       </w:tr>
@@ -4945,7 +4923,6 @@
               </w:rPr>
             </w:pPr>
             <w:proofErr w:type="spellStart"/>
-            <w:proofErr w:type="gramStart"/>
             <w:r>
               <w:rPr>
                 <w:rFonts w:ascii="Calibri" w:hAnsi="Calibri" w:cs="Calibri"/>
@@ -4970,7 +4947,6 @@
               <w:t>decimalnih</w:t>
             </w:r>
             <w:proofErr w:type="spellEnd"/>
-            <w:proofErr w:type="gramEnd"/>
             <w:r>
               <w:rPr>
                 <w:rFonts w:ascii="Calibri" w:hAnsi="Calibri" w:cs="Calibri"/>
@@ -5004,6 +4980,19 @@
                 <w:rFonts w:cstheme="minorHAnsi"/>
               </w:rPr>
               <w:t>34, 35, 36,</w:t>
+            </w:r>
+            <w:r>
+              <w:rPr>
+                <w:rFonts w:cstheme="minorHAnsi"/>
+              </w:rPr>
+              <w:t xml:space="preserve"> </w:t>
+            </w:r>
+            <w:r>
+              <w:rPr>
+                <w:rFonts w:cstheme="minorHAnsi"/>
+                <w:highlight w:val="yellow"/>
+              </w:rPr>
+              <w:t>105</w:t>
             </w:r>
           </w:p>
         </w:tc>
@@ -5913,7 +5902,6 @@
                 <w:sz w:val="24"/>
                 <w:szCs w:val="24"/>
               </w:rPr>
-              <w:lastRenderedPageBreak/>
               <w:t>(2)</w:t>
             </w:r>
           </w:p>
@@ -5933,7 +5921,6 @@
               <w:rPr>
                 <w:rFonts w:cstheme="minorHAnsi"/>
               </w:rPr>
-              <w:lastRenderedPageBreak/>
               <w:t>Sa</w:t>
             </w:r>
             <w:r>
@@ -7008,7 +6995,6 @@
               </w:rPr>
             </w:pPr>
             <w:proofErr w:type="spellStart"/>
-            <w:proofErr w:type="gramStart"/>
             <w:r>
               <w:rPr>
                 <w:rFonts w:cstheme="minorHAnsi"/>
@@ -7016,7 +7002,6 @@
               <w:t>Konveksan,centralni</w:t>
             </w:r>
             <w:proofErr w:type="spellEnd"/>
-            <w:proofErr w:type="gramEnd"/>
             <w:r>
               <w:rPr>
                 <w:rFonts w:cstheme="minorHAnsi"/>
@@ -7075,22 +7060,14 @@
               <w:rPr>
                 <w:rFonts w:cstheme="minorHAnsi"/>
               </w:rPr>
+              <w:t xml:space="preserve">., </w:t>
+            </w:r>
+            <w:r>
+              <w:rPr>
+                <w:rFonts w:cstheme="minorHAnsi"/>
+              </w:rPr>
               <w:t>.</w:t>
             </w:r>
-            <w:proofErr w:type="gramStart"/>
-            <w:r>
-              <w:rPr>
-                <w:rFonts w:cstheme="minorHAnsi"/>
-              </w:rPr>
-              <w:t xml:space="preserve">, </w:t>
-            </w:r>
-            <w:r>
-              <w:rPr>
-                <w:rFonts w:cstheme="minorHAnsi"/>
-              </w:rPr>
-              <w:t>.</w:t>
-            </w:r>
-            <w:proofErr w:type="gramEnd"/>
           </w:p>
         </w:tc>
         <w:tc>
@@ -7371,6 +7348,19 @@
               </w:rPr>
               <w:t>, 32</w:t>
             </w:r>
+            <w:r>
+              <w:rPr>
+                <w:rFonts w:cstheme="minorHAnsi"/>
+              </w:rPr>
+              <w:t xml:space="preserve">, </w:t>
+            </w:r>
+            <w:r>
+              <w:rPr>
+                <w:rFonts w:cstheme="minorHAnsi"/>
+                <w:highlight w:val="yellow"/>
+              </w:rPr>
+              <w:t>246</w:t>
+            </w:r>
           </w:p>
         </w:tc>
       </w:tr>
@@ -7427,21 +7417,7 @@
               <w:rPr>
                 <w:rFonts w:cstheme="minorHAnsi"/>
               </w:rPr>
-              <w:t xml:space="preserve"> </w:t>
-            </w:r>
-            <w:proofErr w:type="spellStart"/>
-            <w:r>
-              <w:rPr>
-                <w:rFonts w:cstheme="minorHAnsi"/>
-              </w:rPr>
-              <w:t>i</w:t>
-            </w:r>
-            <w:proofErr w:type="spellEnd"/>
-            <w:r>
-              <w:rPr>
-                <w:rFonts w:cstheme="minorHAnsi"/>
-              </w:rPr>
-              <w:t xml:space="preserve"> </w:t>
+              <w:t xml:space="preserve"> i </w:t>
             </w:r>
             <w:proofErr w:type="spellStart"/>
             <w:r>
@@ -8322,6 +8298,19 @@
               </w:rPr>
               <w:t>, 20</w:t>
             </w:r>
+            <w:r>
+              <w:rPr>
+                <w:rFonts w:cstheme="minorHAnsi"/>
+              </w:rPr>
+              <w:t xml:space="preserve">, </w:t>
+            </w:r>
+            <w:r>
+              <w:rPr>
+                <w:rFonts w:cstheme="minorHAnsi"/>
+                <w:highlight w:val="yellow"/>
+              </w:rPr>
+              <w:t>76</w:t>
+            </w:r>
           </w:p>
         </w:tc>
       </w:tr>
@@ -8806,6 +8795,12 @@
         </w:tc>
       </w:tr>
     </w:tbl>
+    <w:p/>
+    <w:p/>
+    <w:p/>
+    <w:p/>
+    <w:p/>
+    <w:p/>
     <w:p/>
     <w:p/>
     <w:p/>
@@ -8826,6 +8821,7 @@
           <w:sz w:val="28"/>
           <w:szCs w:val="28"/>
         </w:rPr>
+        <w:lastRenderedPageBreak/>
         <w:t>ŠESTI</w:t>
       </w:r>
       <w:r>
@@ -11755,6 +11751,12 @@
               <w:rPr>
                 <w:rFonts w:cstheme="minorHAnsi"/>
               </w:rPr>
+              <w:t xml:space="preserve"> </w:t>
+            </w:r>
+            <w:r>
+              <w:rPr>
+                <w:rFonts w:cstheme="minorHAnsi"/>
+              </w:rPr>
               <w:t>2</w:t>
             </w:r>
             <w:r>
@@ -11762,6 +11764,19 @@
                 <w:rFonts w:cstheme="minorHAnsi"/>
               </w:rPr>
               <w:t>2</w:t>
+            </w:r>
+            <w:r>
+              <w:rPr>
+                <w:rFonts w:cstheme="minorHAnsi"/>
+              </w:rPr>
+              <w:t xml:space="preserve">, </w:t>
+            </w:r>
+            <w:r>
+              <w:rPr>
+                <w:rFonts w:cstheme="minorHAnsi"/>
+                <w:highlight w:val="yellow"/>
+              </w:rPr>
+              <w:t>129</w:t>
             </w:r>
           </w:p>
         </w:tc>
@@ -11891,6 +11906,19 @@
                 <w:rFonts w:cstheme="minorHAnsi"/>
               </w:rPr>
               <w:t>, 26</w:t>
+            </w:r>
+            <w:r>
+              <w:rPr>
+                <w:rFonts w:cstheme="minorHAnsi"/>
+              </w:rPr>
+              <w:t xml:space="preserve">, </w:t>
+            </w:r>
+            <w:r>
+              <w:rPr>
+                <w:rFonts w:cstheme="minorHAnsi"/>
+                <w:highlight w:val="yellow"/>
+              </w:rPr>
+              <w:t>130</w:t>
             </w:r>
           </w:p>
         </w:tc>
@@ -12082,6 +12110,19 @@
               </w:rPr>
               <w:t>,</w:t>
             </w:r>
+            <w:r>
+              <w:rPr>
+                <w:rFonts w:cstheme="minorHAnsi"/>
+              </w:rPr>
+              <w:t xml:space="preserve"> </w:t>
+            </w:r>
+            <w:r>
+              <w:rPr>
+                <w:rFonts w:cstheme="minorHAnsi"/>
+                <w:highlight w:val="yellow"/>
+              </w:rPr>
+              <w:t>131</w:t>
+            </w:r>
           </w:p>
         </w:tc>
       </w:tr>
@@ -12470,23 +12511,7 @@
                 <w:rFonts w:ascii="Calibri" w:hAnsi="Calibri" w:cs="Calibri"/>
                 <w:color w:val="000000"/>
               </w:rPr>
-              <w:t xml:space="preserve"> </w:t>
-            </w:r>
-            <w:proofErr w:type="spellStart"/>
-            <w:r>
-              <w:rPr>
-                <w:rFonts w:ascii="Calibri" w:hAnsi="Calibri" w:cs="Calibri"/>
-                <w:color w:val="000000"/>
-              </w:rPr>
-              <w:t>i</w:t>
-            </w:r>
-            <w:proofErr w:type="spellEnd"/>
-            <w:r>
-              <w:rPr>
-                <w:rFonts w:ascii="Calibri" w:hAnsi="Calibri" w:cs="Calibri"/>
-                <w:color w:val="000000"/>
-              </w:rPr>
-              <w:t xml:space="preserve"> </w:t>
+              <w:t xml:space="preserve"> i </w:t>
             </w:r>
             <w:proofErr w:type="spellStart"/>
             <w:r>
@@ -12582,27 +12607,13 @@
               <w:rPr>
                 <w:rFonts w:cstheme="minorHAnsi"/>
               </w:rPr>
-              <w:t xml:space="preserve"> </w:t>
-            </w:r>
-            <w:proofErr w:type="gramStart"/>
-            <w:r>
-              <w:rPr>
-                <w:rFonts w:cstheme="minorHAnsi"/>
-              </w:rPr>
-              <w:t xml:space="preserve">52, </w:t>
-            </w:r>
-            <w:r>
-              <w:rPr>
-                <w:rFonts w:cstheme="minorHAnsi"/>
-              </w:rPr>
-              <w:t xml:space="preserve"> 53</w:t>
-            </w:r>
-            <w:proofErr w:type="gramEnd"/>
-            <w:r>
-              <w:rPr>
-                <w:rFonts w:cstheme="minorHAnsi"/>
-              </w:rPr>
-              <w:t>,</w:t>
+              <w:t xml:space="preserve"> 52, </w:t>
+            </w:r>
+            <w:r>
+              <w:rPr>
+                <w:rFonts w:cstheme="minorHAnsi"/>
+              </w:rPr>
+              <w:t xml:space="preserve"> 53,</w:t>
             </w:r>
             <w:r>
               <w:rPr>
@@ -14193,33 +14204,38 @@
               <w:rPr>
                 <w:rFonts w:cstheme="minorHAnsi"/>
               </w:rPr>
+              <w:t>, 98</w:t>
+            </w:r>
+            <w:r>
+              <w:rPr>
+                <w:rFonts w:cstheme="minorHAnsi"/>
+              </w:rPr>
+              <w:t>, 99, 100</w:t>
+            </w:r>
+            <w:r>
+              <w:rPr>
+                <w:rFonts w:cstheme="minorHAnsi"/>
+              </w:rPr>
+              <w:t>, 241</w:t>
+            </w:r>
+            <w:r>
+              <w:rPr>
+                <w:rFonts w:cstheme="minorHAnsi"/>
+              </w:rPr>
+              <w:t>, 242</w:t>
+            </w:r>
+            <w:r>
+              <w:rPr>
+                <w:rFonts w:cstheme="minorHAnsi"/>
+              </w:rPr>
               <w:t xml:space="preserve">, </w:t>
             </w:r>
-            <w:proofErr w:type="gramStart"/>
-            <w:r>
-              <w:rPr>
-                <w:rFonts w:cstheme="minorHAnsi"/>
-              </w:rPr>
-              <w:t>98</w:t>
-            </w:r>
-            <w:proofErr w:type="gramEnd"/>
-            <w:r>
-              <w:rPr>
-                <w:rFonts w:cstheme="minorHAnsi"/>
-              </w:rPr>
-              <w:t>, 99, 100</w:t>
-            </w:r>
-            <w:r>
-              <w:rPr>
-                <w:rFonts w:cstheme="minorHAnsi"/>
-              </w:rPr>
-              <w:t>, 241</w:t>
-            </w:r>
-            <w:r>
-              <w:rPr>
-                <w:rFonts w:cstheme="minorHAnsi"/>
-              </w:rPr>
-              <w:t>, 242</w:t>
+            <w:r>
+              <w:rPr>
+                <w:rFonts w:cstheme="minorHAnsi"/>
+                <w:highlight w:val="yellow"/>
+              </w:rPr>
+              <w:t>247</w:t>
             </w:r>
           </w:p>
         </w:tc>
@@ -14768,6 +14784,26 @@
               </w:rPr>
               <w:t>38</w:t>
             </w:r>
+            <w:r>
+              <w:rPr>
+                <w:rFonts w:cstheme="minorHAnsi"/>
+              </w:rPr>
+              <w:t xml:space="preserve">, </w:t>
+            </w:r>
+            <w:r>
+              <w:rPr>
+                <w:rFonts w:cstheme="minorHAnsi"/>
+                <w:highlight w:val="yellow"/>
+              </w:rPr>
+              <w:t>73</w:t>
+            </w:r>
+            <w:r>
+              <w:rPr>
+                <w:rFonts w:cstheme="minorHAnsi"/>
+                <w:highlight w:val="yellow"/>
+              </w:rPr>
+              <w:t>, 74</w:t>
+            </w:r>
           </w:p>
         </w:tc>
       </w:tr>
@@ -14919,6 +14955,19 @@
               </w:rPr>
               <w:t>72</w:t>
             </w:r>
+            <w:r>
+              <w:rPr>
+                <w:rFonts w:cstheme="minorHAnsi"/>
+              </w:rPr>
+              <w:t xml:space="preserve">, </w:t>
+            </w:r>
+            <w:r>
+              <w:rPr>
+                <w:rFonts w:cstheme="minorHAnsi"/>
+                <w:highlight w:val="yellow"/>
+              </w:rPr>
+              <w:t>77</w:t>
+            </w:r>
           </w:p>
         </w:tc>
       </w:tr>
@@ -15004,7 +15053,6 @@
                 <w:sz w:val="24"/>
                 <w:szCs w:val="24"/>
               </w:rPr>
-              <w:lastRenderedPageBreak/>
               <w:t>dijagramima</w:t>
             </w:r>
             <w:proofErr w:type="spellEnd"/>
@@ -15051,7 +15099,6 @@
               <w:rPr>
                 <w:rFonts w:cstheme="minorHAnsi"/>
               </w:rPr>
-              <w:lastRenderedPageBreak/>
               <w:t>Stubičasti</w:t>
             </w:r>
             <w:proofErr w:type="spellEnd"/>
@@ -15654,6 +15701,20 @@
         </w:tc>
       </w:tr>
     </w:tbl>
+    <w:p/>
+    <w:p/>
+    <w:p/>
+    <w:p/>
+    <w:p/>
+    <w:p/>
+    <w:p/>
+    <w:p/>
+    <w:p/>
+    <w:p/>
+    <w:p/>
+    <w:p/>
+    <w:p/>
+    <w:p/>
     <w:p/>
     <w:p>
       <w:pPr>
@@ -15672,6 +15733,7 @@
           <w:sz w:val="28"/>
           <w:szCs w:val="28"/>
         </w:rPr>
+        <w:lastRenderedPageBreak/>
         <w:t>SEDM</w:t>
       </w:r>
       <w:r>
@@ -17460,23 +17522,7 @@
                 <w:rFonts w:eastAsia="Times New Roman" w:cstheme="minorHAnsi"/>
                 <w:color w:val="333333"/>
               </w:rPr>
-              <w:t xml:space="preserve"> </w:t>
-            </w:r>
-            <w:proofErr w:type="spellStart"/>
-            <w:r>
-              <w:rPr>
-                <w:rFonts w:eastAsia="Times New Roman" w:cstheme="minorHAnsi"/>
-                <w:color w:val="333333"/>
-              </w:rPr>
-              <w:t>sa</w:t>
-            </w:r>
-            <w:proofErr w:type="spellEnd"/>
-            <w:r>
-              <w:rPr>
-                <w:rFonts w:eastAsia="Times New Roman" w:cstheme="minorHAnsi"/>
-                <w:color w:val="333333"/>
-              </w:rPr>
-              <w:t xml:space="preserve"> </w:t>
+              <w:t xml:space="preserve"> sa </w:t>
             </w:r>
             <w:proofErr w:type="spellStart"/>
             <w:r>
@@ -18202,60 +18248,51 @@
                 <w:rFonts w:eastAsia="Times New Roman" w:cstheme="minorHAnsi"/>
                 <w:color w:val="333333"/>
               </w:rPr>
-              <w:t xml:space="preserve"> </w:t>
-            </w:r>
-            <w:proofErr w:type="spellStart"/>
+              <w:t xml:space="preserve"> i</w:t>
+            </w:r>
             <w:r>
               <w:rPr>
                 <w:rFonts w:eastAsia="Times New Roman" w:cstheme="minorHAnsi"/>
                 <w:color w:val="333333"/>
               </w:rPr>
-              <w:t>i</w:t>
-            </w:r>
-            <w:proofErr w:type="spellEnd"/>
+              <w:t xml:space="preserve"> </w:t>
+            </w:r>
+            <w:proofErr w:type="spellStart"/>
             <w:r>
               <w:rPr>
                 <w:rFonts w:eastAsia="Times New Roman" w:cstheme="minorHAnsi"/>
                 <w:color w:val="333333"/>
               </w:rPr>
-              <w:t xml:space="preserve"> </w:t>
-            </w:r>
-            <w:proofErr w:type="spellStart"/>
+              <w:t>oduzimanje</w:t>
+            </w:r>
+            <w:proofErr w:type="spellEnd"/>
             <w:r>
               <w:rPr>
                 <w:rFonts w:eastAsia="Times New Roman" w:cstheme="minorHAnsi"/>
                 <w:color w:val="333333"/>
               </w:rPr>
-              <w:t>oduzimanje</w:t>
-            </w:r>
-            <w:proofErr w:type="spellEnd"/>
+              <w:t xml:space="preserve"> </w:t>
+            </w:r>
+            <w:proofErr w:type="spellStart"/>
             <w:r>
               <w:rPr>
                 <w:rFonts w:eastAsia="Times New Roman" w:cstheme="minorHAnsi"/>
                 <w:color w:val="333333"/>
               </w:rPr>
-              <w:t xml:space="preserve"> </w:t>
-            </w:r>
-            <w:proofErr w:type="spellStart"/>
+              <w:t>pol</w:t>
+            </w:r>
             <w:r>
               <w:rPr>
                 <w:rFonts w:eastAsia="Times New Roman" w:cstheme="minorHAnsi"/>
                 <w:color w:val="333333"/>
               </w:rPr>
-              <w:t>pol</w:t>
+              <w:t>i</w:t>
             </w:r>
             <w:r>
               <w:rPr>
                 <w:rFonts w:eastAsia="Times New Roman" w:cstheme="minorHAnsi"/>
                 <w:color w:val="333333"/>
               </w:rPr>
-              <w:t>i</w:t>
-            </w:r>
-            <w:r>
-              <w:rPr>
-                <w:rFonts w:eastAsia="Times New Roman" w:cstheme="minorHAnsi"/>
-                <w:color w:val="333333"/>
-              </w:rPr>
               <w:t>noma</w:t>
             </w:r>
             <w:proofErr w:type="spellEnd"/>
@@ -18301,6 +18338,19 @@
                 <w:rFonts w:cstheme="minorHAnsi"/>
               </w:rPr>
               <w:t>, 112</w:t>
+            </w:r>
+            <w:r>
+              <w:rPr>
+                <w:rFonts w:cstheme="minorHAnsi"/>
+              </w:rPr>
+              <w:t xml:space="preserve">, </w:t>
+            </w:r>
+            <w:r>
+              <w:rPr>
+                <w:rFonts w:cstheme="minorHAnsi"/>
+                <w:highlight w:val="yellow"/>
+              </w:rPr>
+              <w:t>132</w:t>
             </w:r>
           </w:p>
         </w:tc>
@@ -18985,7 +19035,6 @@
                 <w:rFonts w:eastAsia="Times New Roman" w:cstheme="minorHAnsi"/>
                 <w:color w:val="FF0000"/>
               </w:rPr>
-              <w:lastRenderedPageBreak/>
               <w:t>(1</w:t>
             </w:r>
             <w:r>
@@ -19015,7 +19064,6 @@
                 <w:rFonts w:cstheme="minorHAnsi"/>
                 <w:iCs/>
               </w:rPr>
-              <w:lastRenderedPageBreak/>
               <w:t>Trougao</w:t>
             </w:r>
             <w:proofErr w:type="spellEnd"/>
@@ -20219,21 +20267,12 @@
                 <w:color w:val="000000"/>
               </w:rPr>
             </w:pPr>
-            <w:proofErr w:type="spellStart"/>
-            <w:r>
-              <w:rPr>
-                <w:rFonts w:ascii="Calibri" w:hAnsi="Calibri" w:cs="Calibri"/>
-                <w:color w:val="000000"/>
-              </w:rPr>
-              <w:t>Visina</w:t>
-            </w:r>
-            <w:proofErr w:type="spellEnd"/>
-            <w:r>
-              <w:rPr>
-                <w:rFonts w:ascii="Calibri" w:hAnsi="Calibri" w:cs="Calibri"/>
-                <w:color w:val="000000"/>
-              </w:rPr>
-              <w:t xml:space="preserve">, </w:t>
+            <w:r>
+              <w:rPr>
+                <w:rFonts w:ascii="Calibri" w:hAnsi="Calibri" w:cs="Calibri"/>
+                <w:color w:val="000000"/>
+              </w:rPr>
+              <w:t xml:space="preserve">Visina, </w:t>
             </w:r>
             <w:proofErr w:type="spellStart"/>
             <w:r>
@@ -20425,23 +20464,7 @@
                 <w:rFonts w:ascii="Calibri" w:hAnsi="Calibri" w:cs="Calibri"/>
                 <w:color w:val="000000"/>
               </w:rPr>
-              <w:t xml:space="preserve"> </w:t>
-            </w:r>
-            <w:proofErr w:type="spellStart"/>
-            <w:r>
-              <w:rPr>
-                <w:rFonts w:ascii="Calibri" w:hAnsi="Calibri" w:cs="Calibri"/>
-                <w:color w:val="000000"/>
-              </w:rPr>
-              <w:t>i</w:t>
-            </w:r>
-            <w:proofErr w:type="spellEnd"/>
-            <w:r>
-              <w:rPr>
-                <w:rFonts w:ascii="Calibri" w:hAnsi="Calibri" w:cs="Calibri"/>
-                <w:color w:val="000000"/>
-              </w:rPr>
-              <w:t xml:space="preserve"> </w:t>
+              <w:t xml:space="preserve"> i </w:t>
             </w:r>
             <w:proofErr w:type="spellStart"/>
             <w:r>
@@ -21330,23 +21353,7 @@
                 <w:rFonts w:ascii="Calibri" w:hAnsi="Calibri" w:cs="Calibri"/>
                 <w:color w:val="000000"/>
               </w:rPr>
-              <w:t xml:space="preserve"> </w:t>
-            </w:r>
-            <w:proofErr w:type="spellStart"/>
-            <w:r>
-              <w:rPr>
-                <w:rFonts w:ascii="Calibri" w:hAnsi="Calibri" w:cs="Calibri"/>
-                <w:color w:val="000000"/>
-              </w:rPr>
-              <w:t>i</w:t>
-            </w:r>
-            <w:proofErr w:type="spellEnd"/>
-            <w:r>
-              <w:rPr>
-                <w:rFonts w:ascii="Calibri" w:hAnsi="Calibri" w:cs="Calibri"/>
-                <w:color w:val="000000"/>
-              </w:rPr>
-              <w:t xml:space="preserve"> </w:t>
+              <w:t xml:space="preserve"> i </w:t>
             </w:r>
             <w:proofErr w:type="spellStart"/>
             <w:r>
@@ -21838,10 +21845,33 @@
               </w:rPr>
               <w:t>58, 59, 60, 61</w:t>
             </w:r>
+            <w:r>
+              <w:rPr>
+                <w:rFonts w:cstheme="minorHAnsi"/>
+              </w:rPr>
+              <w:t xml:space="preserve">, </w:t>
+            </w:r>
+            <w:r>
+              <w:rPr>
+                <w:rFonts w:cstheme="minorHAnsi"/>
+                <w:highlight w:val="yellow"/>
+              </w:rPr>
+              <w:t>75</w:t>
+            </w:r>
           </w:p>
         </w:tc>
       </w:tr>
     </w:tbl>
+    <w:p/>
+    <w:p/>
+    <w:p/>
+    <w:p/>
+    <w:p/>
+    <w:p/>
+    <w:p/>
+    <w:p/>
+    <w:p/>
+    <w:p/>
     <w:p/>
     <w:p/>
     <w:p/>
@@ -21863,6 +21893,7 @@
           <w:sz w:val="28"/>
           <w:szCs w:val="28"/>
         </w:rPr>
+        <w:lastRenderedPageBreak/>
         <w:t>OSM</w:t>
       </w:r>
       <w:r>
@@ -22289,7 +22320,6 @@
                 <w:sz w:val="24"/>
                 <w:szCs w:val="24"/>
               </w:rPr>
-              <w:lastRenderedPageBreak/>
               <w:t>(1)</w:t>
             </w:r>
           </w:p>
@@ -22309,7 +22339,6 @@
               <w:rPr>
                 <w:rFonts w:cstheme="minorHAnsi"/>
               </w:rPr>
-              <w:lastRenderedPageBreak/>
               <w:t>Rešenje</w:t>
             </w:r>
             <w:proofErr w:type="spellEnd"/>
@@ -26043,6 +26072,7 @@
                 <w:sz w:val="24"/>
                 <w:szCs w:val="24"/>
               </w:rPr>
+              <w:lastRenderedPageBreak/>
               <w:t>(2</w:t>
             </w:r>
             <w:r>
@@ -26072,6 +26102,7 @@
               <w:rPr>
                 <w:rFonts w:cstheme="minorHAnsi"/>
               </w:rPr>
+              <w:lastRenderedPageBreak/>
               <w:t>Pojam</w:t>
             </w:r>
             <w:proofErr w:type="spellEnd"/>
@@ -27107,7 +27138,6 @@
                 <w:sz w:val="24"/>
                 <w:szCs w:val="24"/>
               </w:rPr>
-              <w:lastRenderedPageBreak/>
               <w:t>(3</w:t>
             </w:r>
             <w:r>
@@ -27138,7 +27168,6 @@
                 <w:rFonts w:ascii="Calibri" w:hAnsi="Calibri" w:cs="Calibri"/>
                 <w:color w:val="000000"/>
               </w:rPr>
-              <w:lastRenderedPageBreak/>
               <w:t>Lopta</w:t>
             </w:r>
             <w:proofErr w:type="spellEnd"/>

</xml_diff>